<commit_message>
Manual updates from user
</commit_message>
<xml_diff>
--- a/Deepanshu_Srivastava_Resume.docx
+++ b/Deepanshu_Srivastava_Resume.docx
@@ -72,25 +72,7 @@
           <w:sz w:val="22"/>
           <w:szCs w:val="22"/>
         </w:rPr>
-        <w:t>Accomplished Technical Lead and Senior Full-Stack Engineer with over 9 years of experience architecting highly scalable, service-oriented distributed systems utilizing JavaScript, Node.js, TypeScript, React.js and Angular. Proven track record of leading development teams in agile environments, spearheading end-to-end enterprise web projects, processing big data in distributed environments, and executing seamless system migrations that deliver up to 40% in operational cost savings. A highly collaborative lea</w:t>
-      </w:r>
-      <w:r>
-        <w:rPr>
-          <w:rFonts w:ascii="Arial" w:hAnsi="Arial" w:cs="Arial"/>
-          <w:color w:val="000000"/>
-          <w:sz w:val="22"/>
-          <w:szCs w:val="22"/>
-        </w:rPr>
-        <w:t>der responsible for team Scaling, Performance,</w:t>
-      </w:r>
-      <w:r>
-        <w:rPr>
-          <w:rFonts w:ascii="Arial" w:hAnsi="Arial" w:cs="Arial"/>
-          <w:color w:val="000000"/>
-          <w:sz w:val="22"/>
-          <w:szCs w:val="22"/>
-        </w:rPr>
-        <w:t xml:space="preserve"> &amp; Quality, adept at driving technology choices, defining project scope with stakeholders, establishing engineering best practices, and troubleshooting complex technical issues to deliver highly available, secure solutions.</w:t>
+        <w:t>Accomplished Technical Lead and Senior Full-Stack Engineer with over 9 years of experience architecting highly scalable, service-oriented distributed systems utilizing JavaScript, Node.js, TypeScript, React.js and Angular. Proven track record of leading development teams in agile environments, spearheading end-to-end enterprise web projects, processing big data in distributed environments, and executing seamless system migrations that deliver up to 40% in operational cost savings. A highly collaborative leader responsible for team Scaling, Performance, &amp; Quality, adept at driving technology choices, defining project scope with stakeholders, establishing engineering best practices, and troubleshooting complex technical issues to deliver highly available, secure solutions.</w:t>
       </w:r>
     </w:p>
     <w:p>
@@ -174,16 +156,7 @@
           <w:sz w:val="22"/>
           <w:szCs w:val="22"/>
         </w:rPr>
-        <w:t xml:space="preserve"> Microservices, Service-Oriented Architecture (SOA), Distributed Systems, Event-Driven Architectures, Micro-frontends, Frontend &amp; </w:t>
-      </w:r>
-      <w:r>
-        <w:rPr>
-          <w:rFonts w:ascii="Arial" w:eastAsia="Times New Roman" w:hAnsi="Arial" w:cs="Arial"/>
-          <w:color w:val="000000"/>
-          <w:sz w:val="22"/>
-          <w:szCs w:val="22"/>
-        </w:rPr>
-        <w:t>Backend Principles, System Design (HLD/LLD), Multi-Tenancy, Single-SPA, Monorepo</w:t>
+        <w:t xml:space="preserve"> Microservices, Service-Oriented Architecture (SOA), Distributed Systems, Event-Driven Architectures, Micro-frontends, Frontend &amp; Backend Principles, System Design (HLD/LLD), Multi-Tenancy, Single-SPA, Monorepo</w:t>
       </w:r>
     </w:p>
     <w:p>
@@ -388,13 +361,33 @@
       </w:r>
       <w:r>
         <w:rPr>
-          <w:rStyle w:val="date"/>
-          <w:rFonts w:ascii="Arial" w:eastAsia="Times New Roman" w:hAnsi="Arial" w:cs="Arial"/>
-          <w:color w:val="000000"/>
-          <w:sz w:val="22"/>
-          <w:szCs w:val="22"/>
-        </w:rPr>
-        <w:t>May 2024 â€“ Present</w:t>
+          <w:rStyle w:val="Date1"/>
+          <w:rFonts w:ascii="Arial" w:eastAsia="Times New Roman" w:hAnsi="Arial" w:cs="Arial"/>
+          <w:color w:val="000000"/>
+          <w:sz w:val="22"/>
+          <w:szCs w:val="22"/>
+        </w:rPr>
+        <w:t xml:space="preserve">May 2024 </w:t>
+      </w:r>
+      <w:r>
+        <w:rPr>
+          <w:rStyle w:val="Date1"/>
+          <w:rFonts w:ascii="Arial" w:eastAsia="Times New Roman" w:hAnsi="Arial" w:cs="Arial"/>
+          <w:color w:val="000000"/>
+          <w:sz w:val="22"/>
+          <w:szCs w:val="22"/>
+        </w:rPr>
+        <w:t>-</w:t>
+      </w:r>
+      <w:r>
+        <w:rPr>
+          <w:rStyle w:val="Date1"/>
+          <w:rFonts w:ascii="Arial" w:eastAsia="Times New Roman" w:hAnsi="Arial" w:cs="Arial"/>
+          <w:color w:val="000000"/>
+          <w:sz w:val="22"/>
+          <w:szCs w:val="22"/>
+        </w:rPr>
+        <w:t xml:space="preserve"> Present</w:t>
       </w:r>
       <w:r>
         <w:rPr>
@@ -553,13 +546,33 @@
       </w:r>
       <w:r>
         <w:rPr>
-          <w:rStyle w:val="date"/>
-          <w:rFonts w:ascii="Arial" w:eastAsia="Times New Roman" w:hAnsi="Arial" w:cs="Arial"/>
-          <w:color w:val="000000"/>
-          <w:sz w:val="22"/>
-          <w:szCs w:val="22"/>
-        </w:rPr>
-        <w:t>Apr 2021 â€“ May 2024</w:t>
+          <w:rStyle w:val="Date1"/>
+          <w:rFonts w:ascii="Arial" w:eastAsia="Times New Roman" w:hAnsi="Arial" w:cs="Arial"/>
+          <w:color w:val="000000"/>
+          <w:sz w:val="22"/>
+          <w:szCs w:val="22"/>
+        </w:rPr>
+        <w:t xml:space="preserve">Apr 2021 </w:t>
+      </w:r>
+      <w:r>
+        <w:rPr>
+          <w:rStyle w:val="Date1"/>
+          <w:rFonts w:ascii="Arial" w:eastAsia="Times New Roman" w:hAnsi="Arial" w:cs="Arial"/>
+          <w:color w:val="000000"/>
+          <w:sz w:val="22"/>
+          <w:szCs w:val="22"/>
+        </w:rPr>
+        <w:t>-</w:t>
+      </w:r>
+      <w:r>
+        <w:rPr>
+          <w:rStyle w:val="Date1"/>
+          <w:rFonts w:ascii="Arial" w:eastAsia="Times New Roman" w:hAnsi="Arial" w:cs="Arial"/>
+          <w:color w:val="000000"/>
+          <w:sz w:val="22"/>
+          <w:szCs w:val="22"/>
+        </w:rPr>
+        <w:t xml:space="preserve"> May 2024</w:t>
       </w:r>
       <w:r>
         <w:rPr>
@@ -789,13 +802,33 @@
       </w:r>
       <w:r>
         <w:rPr>
-          <w:rStyle w:val="date"/>
-          <w:rFonts w:ascii="Arial" w:eastAsia="Times New Roman" w:hAnsi="Arial" w:cs="Arial"/>
-          <w:color w:val="000000"/>
-          <w:sz w:val="22"/>
-          <w:szCs w:val="22"/>
-        </w:rPr>
-        <w:t>Aug 2019 â€“ Mar 2021</w:t>
+          <w:rStyle w:val="Date1"/>
+          <w:rFonts w:ascii="Arial" w:eastAsia="Times New Roman" w:hAnsi="Arial" w:cs="Arial"/>
+          <w:color w:val="000000"/>
+          <w:sz w:val="22"/>
+          <w:szCs w:val="22"/>
+        </w:rPr>
+        <w:t xml:space="preserve">Aug 2019 </w:t>
+      </w:r>
+      <w:r>
+        <w:rPr>
+          <w:rStyle w:val="Date1"/>
+          <w:rFonts w:ascii="Arial" w:eastAsia="Times New Roman" w:hAnsi="Arial" w:cs="Arial"/>
+          <w:color w:val="000000"/>
+          <w:sz w:val="22"/>
+          <w:szCs w:val="22"/>
+        </w:rPr>
+        <w:t>-</w:t>
+      </w:r>
+      <w:r>
+        <w:rPr>
+          <w:rStyle w:val="Date1"/>
+          <w:rFonts w:ascii="Arial" w:eastAsia="Times New Roman" w:hAnsi="Arial" w:cs="Arial"/>
+          <w:color w:val="000000"/>
+          <w:sz w:val="22"/>
+          <w:szCs w:val="22"/>
+        </w:rPr>
+        <w:t xml:space="preserve"> Mar 2021</w:t>
       </w:r>
       <w:r>
         <w:rPr>
@@ -953,13 +986,33 @@
       </w:r>
       <w:r>
         <w:rPr>
-          <w:rStyle w:val="date"/>
-          <w:rFonts w:ascii="Arial" w:eastAsia="Times New Roman" w:hAnsi="Arial" w:cs="Arial"/>
-          <w:color w:val="000000"/>
-          <w:sz w:val="22"/>
-          <w:szCs w:val="22"/>
-        </w:rPr>
-        <w:t>Nov 2018 â€“ Aug 2019</w:t>
+          <w:rStyle w:val="Date1"/>
+          <w:rFonts w:ascii="Arial" w:eastAsia="Times New Roman" w:hAnsi="Arial" w:cs="Arial"/>
+          <w:color w:val="000000"/>
+          <w:sz w:val="22"/>
+          <w:szCs w:val="22"/>
+        </w:rPr>
+        <w:t xml:space="preserve">Nov 2018 </w:t>
+      </w:r>
+      <w:r>
+        <w:rPr>
+          <w:rStyle w:val="Date1"/>
+          <w:rFonts w:ascii="Arial" w:eastAsia="Times New Roman" w:hAnsi="Arial" w:cs="Arial"/>
+          <w:color w:val="000000"/>
+          <w:sz w:val="22"/>
+          <w:szCs w:val="22"/>
+        </w:rPr>
+        <w:t>-</w:t>
+      </w:r>
+      <w:r>
+        <w:rPr>
+          <w:rStyle w:val="Date1"/>
+          <w:rFonts w:ascii="Arial" w:eastAsia="Times New Roman" w:hAnsi="Arial" w:cs="Arial"/>
+          <w:color w:val="000000"/>
+          <w:sz w:val="22"/>
+          <w:szCs w:val="22"/>
+        </w:rPr>
+        <w:t xml:space="preserve"> Aug 2019</w:t>
       </w:r>
       <w:r>
         <w:rPr>
@@ -1069,13 +1122,33 @@
       </w:r>
       <w:r>
         <w:rPr>
-          <w:rStyle w:val="date"/>
-          <w:rFonts w:ascii="Arial" w:eastAsia="Times New Roman" w:hAnsi="Arial" w:cs="Arial"/>
-          <w:color w:val="000000"/>
-          <w:sz w:val="22"/>
-          <w:szCs w:val="22"/>
-        </w:rPr>
-        <w:t>Jan 2017 â€“ Jan 2018</w:t>
+          <w:rStyle w:val="Date1"/>
+          <w:rFonts w:ascii="Arial" w:eastAsia="Times New Roman" w:hAnsi="Arial" w:cs="Arial"/>
+          <w:color w:val="000000"/>
+          <w:sz w:val="22"/>
+          <w:szCs w:val="22"/>
+        </w:rPr>
+        <w:t xml:space="preserve">Jan 2017 </w:t>
+      </w:r>
+      <w:r>
+        <w:rPr>
+          <w:rStyle w:val="Date1"/>
+          <w:rFonts w:ascii="Arial" w:eastAsia="Times New Roman" w:hAnsi="Arial" w:cs="Arial"/>
+          <w:color w:val="000000"/>
+          <w:sz w:val="22"/>
+          <w:szCs w:val="22"/>
+        </w:rPr>
+        <w:t>-</w:t>
+      </w:r>
+      <w:r>
+        <w:rPr>
+          <w:rStyle w:val="Date1"/>
+          <w:rFonts w:ascii="Arial" w:eastAsia="Times New Roman" w:hAnsi="Arial" w:cs="Arial"/>
+          <w:color w:val="000000"/>
+          <w:sz w:val="22"/>
+          <w:szCs w:val="22"/>
+        </w:rPr>
+        <w:t xml:space="preserve"> Jan 2018</w:t>
       </w:r>
       <w:r>
         <w:rPr>
@@ -2752,8 +2825,8 @@
       <w:bCs/>
     </w:rPr>
   </w:style>
-  <w:style w:type="character" w:customStyle="1" w:styleId="date">
-    <w:name w:val="date"/>
+  <w:style w:type="character" w:customStyle="1" w:styleId="Date1">
+    <w:name w:val="Date1"/>
     <w:basedOn w:val="DefaultParagraphFont"/>
   </w:style>
 </w:styles>

</xml_diff>